<commit_message>
github initial to master commit
</commit_message>
<xml_diff>
--- a/info_main/docs/Schwab Market Data Loader.docx
+++ b/info_main/docs/Schwab Market Data Loader.docx
@@ -245,6 +245,13 @@
             </a:graphic>
           </wp:inline>
         </w:drawing>
+      </w:r>
+      <w:r>
+        <w:rPr>
+          <w:sz w:val="20"/>
+          <w:szCs w:val="20"/>
+        </w:rPr>
+        <w:t xml:space="preserve"> </w:t>
       </w:r>
     </w:p>
     <w:p>

</xml_diff>